<commit_message>
chore: setup HW3 flash sale project
</commit_message>
<xml_diff>
--- a/LAB 2.docx
+++ b/LAB 2.docx
@@ -376,7 +376,29 @@
           <w:szCs w:val="32"/>
           <w:lang w:val="vi-VN"/>
         </w:rPr>
-        <w:t xml:space="preserve"> 1 – HOMEWORK</w:t>
+        <w:t xml:space="preserve"> </w:t>
+      </w:r>
+      <w:r>
+        <w:rPr>
+          <w:rFonts w:ascii="Times  New Roman" w:hAnsi="Times  New Roman"/>
+          <w:b/>
+          <w:bCs/>
+          <w:sz w:val="32"/>
+          <w:szCs w:val="32"/>
+          <w:lang w:val="vi-VN"/>
+        </w:rPr>
+        <w:t>2</w:t>
+      </w:r>
+      <w:r>
+        <w:rPr>
+          <w:rFonts w:ascii="Times  New Roman" w:hAnsi="Times  New Roman"/>
+          <w:b/>
+          <w:bCs/>
+          <w:sz w:val="32"/>
+          <w:szCs w:val="32"/>
+          <w:lang w:val="vi-VN"/>
+        </w:rPr>
+        <w:t xml:space="preserve"> – HOMEWORK</w:t>
       </w:r>
       <w:r>
         <w:rPr>
@@ -460,10 +482,10 @@
           <w:noProof/>
         </w:rPr>
         <w:drawing>
-          <wp:inline distT="0" distB="0" distL="0" distR="0" wp14:anchorId="0AE96044" wp14:editId="1B16D7B7">
-            <wp:extent cx="8863330" cy="1515110"/>
-            <wp:effectExtent l="0" t="0" r="0" b="8890"/>
-            <wp:docPr id="1152919894" name="Picture 1152919894" descr="The diagram illustrates a sequence of steps for creating a polyphonic drum pad interface using HTML and JavaScript, where sounds are triggered by key events, and overlapping sounds are managed through a FIFO (First In, First Out) queue.&#10;&#10;AI-generated content may be incorrect."/>
+          <wp:inline distT="0" distB="0" distL="0" distR="0" wp14:anchorId="1C098329" wp14:editId="73C045DC">
+            <wp:extent cx="8863330" cy="1797685"/>
+            <wp:effectExtent l="0" t="0" r="0" b="0"/>
+            <wp:docPr id="704571545" name="Picture 2" descr="The diagram illustrates a multi-layered audio processing flow, starting with an audio queue and progressing through various audio-related components such as an engine, steps, queues, a polyphonic visualizer, and various audio functionalities like fetching tracks, decoding, cleanup, and rendering.&#10;&#10;AI-generated content may be incorrect."/>
             <wp:cNvGraphicFramePr>
               <a:graphicFrameLocks xmlns:a="http://schemas.openxmlformats.org/drawingml/2006/main" noChangeAspect="1"/>
             </wp:cNvGraphicFramePr>
@@ -471,25 +493,36 @@
               <a:graphicData uri="http://schemas.openxmlformats.org/drawingml/2006/picture">
                 <pic:pic xmlns:pic="http://schemas.openxmlformats.org/drawingml/2006/picture">
                   <pic:nvPicPr>
-                    <pic:cNvPr id="1152919894" name="Picture 1152919894" descr="The diagram illustrates a sequence of steps for creating a polyphonic drum pad interface using HTML and JavaScript, where sounds are triggered by key events, and overlapping sounds are managed through a FIFO (First In, First Out) queue.&#10;&#10;AI-generated content may be incorrect."/>
+                    <pic:cNvPr id="704571545" name="Picture 2" descr="The diagram illustrates a multi-layered audio processing flow, starting with an audio queue and progressing through various audio-related components such as an engine, steps, queues, a polyphonic visualizer, and various audio functionalities like fetching tracks, decoding, cleanup, and rendering.&#10;&#10;AI-generated content may be incorrect."/>
                     <pic:cNvPicPr>
-                      <a:picLocks noChangeAspect="1"/>
+                      <a:picLocks noChangeAspect="1" noChangeArrowheads="1"/>
                     </pic:cNvPicPr>
                   </pic:nvPicPr>
                   <pic:blipFill>
-                    <a:blip r:embed="rId7"/>
+                    <a:blip r:embed="rId7" cstate="print">
+                      <a:extLst>
+                        <a:ext uri="{28A0092B-C50C-407E-A947-70E740481C1C}">
+                          <a14:useLocalDpi xmlns:a14="http://schemas.microsoft.com/office/drawing/2010/main" val="0"/>
+                        </a:ext>
+                      </a:extLst>
+                    </a:blip>
+                    <a:srcRect/>
                     <a:stretch>
                       <a:fillRect/>
                     </a:stretch>
                   </pic:blipFill>
-                  <pic:spPr>
+                  <pic:spPr bwMode="auto">
                     <a:xfrm>
                       <a:off x="0" y="0"/>
-                      <a:ext cx="8863330" cy="1515110"/>
+                      <a:ext cx="8863330" cy="1797685"/>
                     </a:xfrm>
                     <a:prstGeom prst="rect">
                       <a:avLst/>
                     </a:prstGeom>
+                    <a:noFill/>
+                    <a:ln>
+                      <a:noFill/>
+                    </a:ln>
                   </pic:spPr>
                 </pic:pic>
               </a:graphicData>
@@ -526,26 +559,30 @@
     </w:p>
     <w:p>
       <w:pPr>
-        <w:ind w:left="360"/>
-        <w:jc w:val="right"/>
         <w:rPr>
           <w:rFonts w:ascii="Times  New Roman" w:hAnsi="Times  New Roman"/>
           <w:b/>
           <w:bCs/>
           <w:sz w:val="22"/>
           <w:szCs w:val="22"/>
-        </w:rPr>
-      </w:pPr>
-      <w:r>
-        <w:rPr>
-          <w:noProof/>
+          <w:lang w:val="vi-VN"/>
+        </w:rPr>
+      </w:pPr>
+      <w:r>
+        <w:rPr>
+          <w:rFonts w:ascii="Times  New Roman" w:hAnsi="Times  New Roman"/>
+          <w:b/>
+          <w:bCs/>
+          <w:sz w:val="22"/>
+          <w:szCs w:val="22"/>
+          <w:lang w:val="vi-VN"/>
         </w:rPr>
         <w:lastRenderedPageBreak/>
         <w:drawing>
-          <wp:inline distT="0" distB="0" distL="0" distR="0" wp14:anchorId="343920AD" wp14:editId="53D7410C">
-            <wp:extent cx="8863330" cy="5010150"/>
-            <wp:effectExtent l="0" t="0" r="0" b="0"/>
-            <wp:docPr id="1666137681" name="Picture 1" descr="The image is a web interface displaying a drum kit engine interface with various keys (A, S, D, F) and timestamps, suggesting it is a visual representation of a drum kit or rhythm pattern.&#10;&#10;AI-generated content may be incorrect."/>
+          <wp:inline distT="0" distB="0" distL="0" distR="0" wp14:anchorId="6A6BE7D8" wp14:editId="2E76852D">
+            <wp:extent cx="8863330" cy="4948555"/>
+            <wp:effectExtent l="0" t="0" r="0" b="4445"/>
+            <wp:docPr id="1194072803" name="Picture 1" descr="The image displays a user interface of the Frequency Visualizer tool, showing a performance score chart, and options to play, pause, and record audio, with specific time durations for different keys pressed.&#10;&#10;AI-generated content may be incorrect."/>
             <wp:cNvGraphicFramePr>
               <a:graphicFrameLocks xmlns:a="http://schemas.openxmlformats.org/drawingml/2006/main" noChangeAspect="1"/>
             </wp:cNvGraphicFramePr>
@@ -553,7 +590,7 @@
               <a:graphicData uri="http://schemas.openxmlformats.org/drawingml/2006/picture">
                 <pic:pic xmlns:pic="http://schemas.openxmlformats.org/drawingml/2006/picture">
                   <pic:nvPicPr>
-                    <pic:cNvPr id="1666137681" name="Picture 1" descr="The image is a web interface displaying a drum kit engine interface with various keys (A, S, D, F) and timestamps, suggesting it is a visual representation of a drum kit or rhythm pattern.&#10;&#10;AI-generated content may be incorrect."/>
+                    <pic:cNvPr id="1194072803" name="Picture 1" descr="The image displays a user interface of the Frequency Visualizer tool, showing a performance score chart, and options to play, pause, and record audio, with specific time durations for different keys pressed.&#10;&#10;AI-generated content may be incorrect."/>
                     <pic:cNvPicPr/>
                   </pic:nvPicPr>
                   <pic:blipFill>
@@ -565,7 +602,7 @@
                   <pic:spPr>
                     <a:xfrm>
                       <a:off x="0" y="0"/>
-                      <a:ext cx="8863330" cy="5010150"/>
+                      <a:ext cx="8863330" cy="4948555"/>
                     </a:xfrm>
                     <a:prstGeom prst="rect">
                       <a:avLst/>
@@ -621,7 +658,29 @@
           <w:szCs w:val="32"/>
           <w:lang w:val="vi-VN"/>
         </w:rPr>
-        <w:t xml:space="preserve"> 1 – HOMEWORK</w:t>
+        <w:t xml:space="preserve"> </w:t>
+      </w:r>
+      <w:r>
+        <w:rPr>
+          <w:rFonts w:ascii="Times  New Roman" w:hAnsi="Times  New Roman"/>
+          <w:b/>
+          <w:bCs/>
+          <w:sz w:val="32"/>
+          <w:szCs w:val="32"/>
+          <w:lang w:val="vi-VN"/>
+        </w:rPr>
+        <w:t>2</w:t>
+      </w:r>
+      <w:r>
+        <w:rPr>
+          <w:rFonts w:ascii="Times  New Roman" w:hAnsi="Times  New Roman"/>
+          <w:b/>
+          <w:bCs/>
+          <w:sz w:val="32"/>
+          <w:szCs w:val="32"/>
+          <w:lang w:val="vi-VN"/>
+        </w:rPr>
+        <w:t xml:space="preserve"> – HOMEWORK</w:t>
       </w:r>
       <w:r>
         <w:rPr>

</xml_diff>